<commit_message>
Answer the language question honestly in the rating paper
The four grawlix barks stay, so the content table now says the
language item is present rather than leaving it open.

Co-Authored-By: Claude Opus 5 <noreply@anthropic.com>
</commit_message>
<xml_diff>
--- a/store-assets/grac/게임물내용설명서_메이즈위스커스_초안.docx
+++ b/store-assets/grac/게임물내용설명서_메이즈위스커스_초안.docx
@@ -4767,7 +4767,7 @@
                 <w:sz w:val="19"/>
                 <w:szCs w:val="19"/>
               </w:rPr>
-              <w:t xml:space="preserve">확인 요망</w:t>
+              <w:t xml:space="preserve">있음(경미)</w:t>
             </w:r>
           </w:p>
         </w:tc>
@@ -4799,7 +4799,7 @@
                 <w:sz w:val="19"/>
                 <w:szCs w:val="19"/>
               </w:rPr>
-              <w:t xml:space="preserve">비속어·욕설 글자는 없습니다. 다만 캐릭터가 놀라거나 맞을 때 욕설을 기호로 가린 만화식 표현 4종이 말풍선으로 나옵니다: “아오 %$#%!”, “$@#^%#&amp;*!”, “@#$%! 저리 가!”, “#$%@!”. 검은 고양이의 놀림 대사(“월세나 내라옹”, “보증금 5억이다냥” 등)는 비속어를 포함하지 않습니다.</w:t>
+              <w:t xml:space="preserve">비속어·욕설 글자는 없습니다. 캐릭터가 놀라거나 맞을 때 욕설을 기호로 가린 만화식 표현 4종이 말풍선으로 나옵니다: “아오 %$#%!”, “$@#^%#&amp;*!”, “@#$%! 저리 가!”, “#$%@!”. 검은 고양이의 놀림 대사(“월세나 내라옹”, “보증금 5억이다냥” 등)는 비속어를 포함하지 않습니다.</w:t>
             </w:r>
           </w:p>
         </w:tc>

</xml_diff>

<commit_message>
Write down what a city could be, and say the ice out loud
Twenty kinds of city for the daily, as a design document: six shapes, eight
kinds of alley, two sizes, four surfaces, with what each one costs to build
and what it would have to pass first. The point of the document is that the
daily is generated, not picked from a shelf — twenty is the number of kinds,
not the number of maps.

Also records the ice in the work guide and in the rating paper, which has to
describe what the player actually meets.

Co-Authored-By: Claude Opus 5 <noreply@anthropic.com>
</commit_message>
<xml_diff>
--- a/store-assets/grac/게임물내용설명서_메이즈위스커스_초안.docx
+++ b/store-assets/grac/게임물내용설명서_메이즈위스커스_초안.docx
@@ -2489,6 +2489,66 @@
         <w:rPr>
           <w:rFonts w:ascii="Malgun Gothic" w:cs="Malgun Gothic" w:eastAsia="Malgun Gothic" w:hAnsi="Malgun Gothic"/>
         </w:rPr>
+        <w:t xml:space="preserve">빙판</w:t>
+      </w:r>
+    </w:p>
+    <w:p>
+      <w:pPr>
+        <w:pStyle w:val="ListParagraph"/>
+        <w:numPr>
+          <w:ilvl w:val="0"/>
+          <w:numId w:val="2"/>
+        </w:numPr>
+        <w:spacing w:after="60" w:line="290"/>
+      </w:pPr>
+      <w:r>
+        <w:rPr>
+          <w:rFonts w:ascii="Malgun Gothic" w:cs="Malgun Gothic" w:eastAsia="Malgun Gothic" w:hAnsi="Malgun Gothic"/>
+        </w:rPr>
+        <w:t xml:space="preserve">일부 골목이 얼어 있습니다. 빙판 칸에 들어서면 고양이가 들어간 방향으로 계속 미끄러지며, 빙판이 끝나는 칸에서 멈춥니다. 벽이나 아파트에 닿아도 멈춥니다.</w:t>
+      </w:r>
+    </w:p>
+    <w:p>
+      <w:pPr>
+        <w:pStyle w:val="ListParagraph"/>
+        <w:numPr>
+          <w:ilvl w:val="0"/>
+          <w:numId w:val="2"/>
+        </w:numPr>
+        <w:spacing w:after="60" w:line="290"/>
+      </w:pPr>
+      <w:r>
+        <w:rPr>
+          <w:rFonts w:ascii="Malgun Gothic" w:cs="Malgun Gothic" w:eastAsia="Malgun Gothic" w:hAnsi="Malgun Gothic"/>
+        </w:rPr>
+        <w:t xml:space="preserve">미끄러지는 동안에는 조작이 반영되지 않습니다. 점프(우유)를 쓰면 빠져나올 수 있습니다. 빙판 때문에 체력이 줄거나 게임이 끝나지는 않습니다.</w:t>
+      </w:r>
+    </w:p>
+    <w:p>
+      <w:pPr>
+        <w:pStyle w:val="ListParagraph"/>
+        <w:numPr>
+          <w:ilvl w:val="0"/>
+          <w:numId w:val="2"/>
+        </w:numPr>
+        <w:spacing w:after="60" w:line="290"/>
+      </w:pPr>
+      <w:r>
+        <w:rPr>
+          <w:rFonts w:ascii="Malgun Gothic" w:cs="Malgun Gothic" w:eastAsia="Malgun Gothic" w:hAnsi="Malgun Gothic"/>
+        </w:rPr>
+        <w:t xml:space="preserve">빙판은 ‘오늘의 도시’에서만 나오며, 날마다 비율이 다릅니다(없음/10%/30%/55%). 시작 지점과 목적지 주변은 얼지 않습니다.</w:t>
+      </w:r>
+    </w:p>
+    <w:p>
+      <w:pPr>
+        <w:pStyle w:val="Heading2"/>
+        <w:spacing w:after="120" w:before="240"/>
+      </w:pPr>
+      <w:r>
+        <w:rPr>
+          <w:rFonts w:ascii="Malgun Gothic" w:cs="Malgun Gothic" w:eastAsia="Malgun Gothic" w:hAnsi="Malgun Gothic"/>
+        </w:rPr>
         <w:t xml:space="preserve">오늘의 도시</w:t>
       </w:r>
     </w:p>
@@ -2506,6 +2566,22 @@
           <w:rFonts w:ascii="Malgun Gothic" w:cs="Malgun Gothic" w:eastAsia="Malgun Gothic" w:hAnsi="Malgun Gothic"/>
         </w:rPr>
         <w:t xml:space="preserve">메뉴의 “오늘의 도시”를 고르면 그날 모든 이용자에게 같은 미로가 나옵니다(한국 날짜 기준으로 하루에 하나). 규칙과 점수 계산은 일반 플레이와 같고, 점수는 같은 순위표에 기록됩니다.</w:t>
+      </w:r>
+    </w:p>
+    <w:p>
+      <w:pPr>
+        <w:pStyle w:val="ListParagraph"/>
+        <w:numPr>
+          <w:ilvl w:val="0"/>
+          <w:numId w:val="2"/>
+        </w:numPr>
+        <w:spacing w:after="60" w:line="290"/>
+      </w:pPr>
+      <w:r>
+        <w:rPr>
+          <w:rFonts w:ascii="Malgun Gothic" w:cs="Malgun Gothic" w:eastAsia="Malgun Gothic" w:hAnsi="Malgun Gothic"/>
+        </w:rPr>
+        <w:t xml:space="preserve">날마다 도시의 종류(모양·크기·골목의 성격·빙판 비율)가 달라집니다.</w:t>
       </w:r>
     </w:p>
     <w:p>

</xml_diff>